<commit_message>
Remove continuation module from latest NXT backtest
</commit_message>
<xml_diff>
--- a/latest/NXT_Latest_NXT32_System_And_Indicators.docx
+++ b/latest/NXT_Latest_NXT32_System_And_Indicators.docx
@@ -7,12 +7,12 @@
         <w:pStyle w:val="Title"/>
       </w:pPr>
       <w:r>
-        <w:t>NXT v3.2 + Continuation</w:t>
+        <w:t>NXT v3.2 Simple</w:t>
       </w:r>
     </w:p>
     <w:p>
       <w:r>
-        <w:t>Latest selected system: UTC+7 daily candles, Runner A, continuation module, no risk-off overlay.</w:t>
+        <w:t>Latest selected system: UTC+7 daily candles, Runner A, no continuation module, no risk-off overlay.</w:t>
       </w:r>
     </w:p>
     <w:p>
@@ -72,7 +72,7 @@
           </w:tcPr>
           <w:p>
             <w:r>
-              <w:t>NXT v3.2</w:t>
+              <w:t>NXT v3.2 Simple</w:t>
             </w:r>
           </w:p>
         </w:tc>
@@ -106,7 +106,7 @@
           </w:tcPr>
           <w:p>
             <w:r>
-              <w:t>Total trades</w:t>
+              <w:t>Trades</w:t>
             </w:r>
           </w:p>
         </w:tc>
@@ -116,7 +116,7 @@
           </w:tcPr>
           <w:p>
             <w:r>
-              <w:t>186</w:t>
+              <w:t>123</w:t>
             </w:r>
           </w:p>
         </w:tc>
@@ -138,7 +138,7 @@
           </w:tcPr>
           <w:p>
             <w:r>
-              <w:t>50.00%</w:t>
+              <w:t>52.03%</w:t>
             </w:r>
           </w:p>
         </w:tc>
@@ -160,7 +160,7 @@
           </w:tcPr>
           <w:p>
             <w:r>
-              <w:t>65.70R</w:t>
+              <w:t>55.74R</w:t>
             </w:r>
           </w:p>
         </w:tc>
@@ -182,7 +182,7 @@
           </w:tcPr>
           <w:p>
             <w:r>
-              <w:t>0.35R</w:t>
+              <w:t>0.45R</w:t>
             </w:r>
           </w:p>
         </w:tc>
@@ -204,51 +204,7 @@
           </w:tcPr>
           <w:p>
             <w:r>
-              <w:t>-7.81R</w:t>
-            </w:r>
-          </w:p>
-        </w:tc>
-      </w:tr>
-      <w:tr>
-        <w:tc>
-          <w:tcPr>
-            <w:tcW w:type="dxa" w:w="4320"/>
-          </w:tcPr>
-          <w:p>
-            <w:r>
-              <w:t>Continuation trades</w:t>
-            </w:r>
-          </w:p>
-        </w:tc>
-        <w:tc>
-          <w:tcPr>
-            <w:tcW w:type="dxa" w:w="4320"/>
-          </w:tcPr>
-          <w:p>
-            <w:r>
-              <w:t>63</w:t>
-            </w:r>
-          </w:p>
-        </w:tc>
-      </w:tr>
-      <w:tr>
-        <w:tc>
-          <w:tcPr>
-            <w:tcW w:type="dxa" w:w="4320"/>
-          </w:tcPr>
-          <w:p>
-            <w:r>
-              <w:t>Continuation R</w:t>
-            </w:r>
-          </w:p>
-        </w:tc>
-        <w:tc>
-          <w:tcPr>
-            <w:tcW w:type="dxa" w:w="4320"/>
-          </w:tcPr>
-          <w:p>
-            <w:r>
-              <w:t>9.96R</w:t>
+              <w:t>-10.62R</w:t>
             </w:r>
           </w:p>
         </w:tc>
@@ -259,7 +215,7 @@
         <w:pStyle w:val="Heading1"/>
       </w:pPr>
       <w:r>
-        <w:t>Indicators</w:t>
+        <w:t>Rules</w:t>
       </w:r>
     </w:p>
     <w:p>
@@ -267,7 +223,7 @@
         <w:pStyle w:val="ListBullet"/>
       </w:pPr>
       <w:r>
-        <w:t>SSL Channel 10/10: primary trend flip and runner exit signal.</w:t>
+        <w:t>Daily candles are resampled to UTC+7 to match the local TradingView chart.</w:t>
       </w:r>
     </w:p>
     <w:p>
@@ -275,7 +231,7 @@
         <w:pStyle w:val="ListBullet"/>
       </w:pPr>
       <w:r>
-        <w:t>EMA20 and EMA50: EMA20 cross/reclaim and EMA50 distance filter.</w:t>
+        <w:t>Primary LONG: SSL flips bullish, EMA20 cross within last 3 candles, distance to EMA50 &lt;= 2 ATR, RSI14 &gt; 50.</w:t>
       </w:r>
     </w:p>
     <w:p>
@@ -283,7 +239,7 @@
         <w:pStyle w:val="ListBullet"/>
       </w:pPr>
       <w:r>
-        <w:t>ATR(14): stop, TP1 trigger and distance normalization.</w:t>
+        <w:t>Primary SHORT: SSL flips bearish, EMA20 cross down within last 3 candles, distance to EMA50 &lt;= 2 ATR, RSI14 &lt; 50.</w:t>
       </w:r>
     </w:p>
     <w:p>
@@ -291,15 +247,7 @@
         <w:pStyle w:val="ListBullet"/>
       </w:pPr>
       <w:r>
-        <w:t>RSI(14): regime/noise filter for primary and continuation entries.</w:t>
-      </w:r>
-    </w:p>
-    <w:p>
-      <w:pPr>
-        <w:pStyle w:val="Heading1"/>
-      </w:pPr>
-      <w:r>
-        <w:t>Primary Entry Rules</w:t>
+        <w:t>Runner A: close 50% at 2.5 ATR, move remaining 50% to breakeven, exit runner on opposite SSL flip.</w:t>
       </w:r>
     </w:p>
     <w:p>
@@ -307,7 +255,7 @@
         <w:pStyle w:val="ListBullet"/>
       </w:pPr>
       <w:r>
-        <w:t>LONG: SSL flips bullish, price crosses above EMA20 within 3 candles, distance to EMA50 &lt;= 2 ATR, RSI14 &gt; 50.</w:t>
+        <w:t>Continuation module is disabled.</w:t>
       </w:r>
     </w:p>
     <w:p>
@@ -315,103 +263,7 @@
         <w:pStyle w:val="ListBullet"/>
       </w:pPr>
       <w:r>
-        <w:t>SHORT: SSL flips bearish, price crosses below EMA20 within 3 candles, distance to EMA50 &lt;= 2 ATR, RSI14 &lt; 50.</w:t>
-      </w:r>
-    </w:p>
-    <w:p>
-      <w:pPr>
-        <w:pStyle w:val="ListBullet"/>
-      </w:pPr>
-      <w:r>
-        <w:t>Entry is next UTC+7 daily open after signal candle close.</w:t>
-      </w:r>
-    </w:p>
-    <w:p>
-      <w:pPr>
-        <w:pStyle w:val="Heading1"/>
-      </w:pPr>
-      <w:r>
-        <w:t>Continuation Module</w:t>
-      </w:r>
-    </w:p>
-    <w:p>
-      <w:pPr>
-        <w:pStyle w:val="ListBullet"/>
-      </w:pPr>
-      <w:r>
-        <w:t>Continuation is only added when no primary trade on the same symbol is already open.</w:t>
-      </w:r>
-    </w:p>
-    <w:p>
-      <w:pPr>
-        <w:pStyle w:val="ListBullet"/>
-      </w:pPr>
-      <w:r>
-        <w:t>SSL re-entry must occur within the last 3 candles.</w:t>
-      </w:r>
-    </w:p>
-    <w:p>
-      <w:pPr>
-        <w:pStyle w:val="ListBullet"/>
-      </w:pPr>
-      <w:r>
-        <w:t>Distance to EMA50 must be &lt;= 2.5 ATR.</w:t>
-      </w:r>
-    </w:p>
-    <w:p>
-      <w:pPr>
-        <w:pStyle w:val="ListBullet"/>
-      </w:pPr>
-      <w:r>
-        <w:t>LONG continuation requires RSI14 &gt; 55 and close above EMA20.</w:t>
-      </w:r>
-    </w:p>
-    <w:p>
-      <w:pPr>
-        <w:pStyle w:val="ListBullet"/>
-      </w:pPr>
-      <w:r>
-        <w:t>SHORT continuation requires RSI14 &lt; 45 and close below EMA20.</w:t>
-      </w:r>
-    </w:p>
-    <w:p>
-      <w:pPr>
-        <w:pStyle w:val="Heading1"/>
-      </w:pPr>
-      <w:r>
-        <w:t>Exit Rules</w:t>
-      </w:r>
-    </w:p>
-    <w:p>
-      <w:pPr>
-        <w:pStyle w:val="ListBullet"/>
-      </w:pPr>
-      <w:r>
-        <w:t>Runner A: close 50% at TP1 = 2.5 ATR.</w:t>
-      </w:r>
-    </w:p>
-    <w:p>
-      <w:pPr>
-        <w:pStyle w:val="ListBullet"/>
-      </w:pPr>
-      <w:r>
-        <w:t>Move stop on remaining 50% to breakeven after TP1.</w:t>
-      </w:r>
-    </w:p>
-    <w:p>
-      <w:pPr>
-        <w:pStyle w:val="ListBullet"/>
-      </w:pPr>
-      <w:r>
-        <w:t>Remaining runner exits on opposite SSL flip or breakeven stop.</w:t>
-      </w:r>
-    </w:p>
-    <w:p>
-      <w:pPr>
-        <w:pStyle w:val="ListBullet"/>
-      </w:pPr>
-      <w:r>
-        <w:t>No risk-off overlay is applied in v3.2.</w:t>
+        <w:t>Risk-off overlay is disabled.</w:t>
       </w:r>
     </w:p>
     <w:sectPr>

</xml_diff>

<commit_message>
NXT 3.2 có filter 20%, setup scheduler
</commit_message>
<xml_diff>
--- a/latest/NXT_Latest_NXT32_System_And_Indicators.docx
+++ b/latest/NXT_Latest_NXT32_System_And_Indicators.docx
@@ -7,12 +7,12 @@
         <w:pStyle w:val="Title"/>
       </w:pPr>
       <w:r>
-        <w:t>NXT v3.2 Simple</w:t>
+        <w:t>NXT v3.2 Latest System And Indicators</w:t>
       </w:r>
     </w:p>
     <w:p>
       <w:r>
-        <w:t>Latest selected system: UTC+7 daily candles, Runner A, no continuation module, no risk-off overlay.</w:t>
+        <w:t>Current promoted latest system as of this workbook refresh.</w:t>
       </w:r>
     </w:p>
     <w:p>
@@ -72,7 +72,7 @@
           </w:tcPr>
           <w:p>
             <w:r>
-              <w:t>NXT v3.2 Simple</w:t>
+              <w:t>NXT v3.2 Simple + Binance Native 1D + TradingView ATR RMA + Runner A + 20% Reversal-Skip + No Continuation + No Risk-Off</w:t>
             </w:r>
           </w:p>
         </w:tc>
@@ -84,7 +84,7 @@
           </w:tcPr>
           <w:p>
             <w:r>
-              <w:t>Timezone</w:t>
+              <w:t>Data standard</w:t>
             </w:r>
           </w:p>
         </w:tc>
@@ -94,7 +94,29 @@
           </w:tcPr>
           <w:p>
             <w:r>
-              <w:t>Asia/Saigon UTC+7 daily candles</w:t>
+              <w:t>Binance native 1D candles</w:t>
+            </w:r>
+          </w:p>
+        </w:tc>
+      </w:tr>
+      <w:tr>
+        <w:tc>
+          <w:tcPr>
+            <w:tcW w:type="dxa" w:w="4320"/>
+          </w:tcPr>
+          <w:p>
+            <w:r>
+              <w:t>ATR standard</w:t>
+            </w:r>
+          </w:p>
+        </w:tc>
+        <w:tc>
+          <w:tcPr>
+            <w:tcW w:type="dxa" w:w="4320"/>
+          </w:tcPr>
+          <w:p>
+            <w:r>
+              <w:t>TradingView ATR14 Wilder RMA</w:t>
             </w:r>
           </w:p>
         </w:tc>
@@ -116,7 +138,7 @@
           </w:tcPr>
           <w:p>
             <w:r>
-              <w:t>123</w:t>
+              <w:t>173</w:t>
             </w:r>
           </w:p>
         </w:tc>
@@ -138,7 +160,7 @@
           </w:tcPr>
           <w:p>
             <w:r>
-              <w:t>52.03%</w:t>
+              <w:t>47.40%</w:t>
             </w:r>
           </w:p>
         </w:tc>
@@ -160,7 +182,7 @@
           </w:tcPr>
           <w:p>
             <w:r>
-              <w:t>55.74R</w:t>
+              <w:t>65.09R</w:t>
             </w:r>
           </w:p>
         </w:tc>
@@ -182,7 +204,7 @@
           </w:tcPr>
           <w:p>
             <w:r>
-              <w:t>0.45R</w:t>
+              <w:t>0.38R</w:t>
             </w:r>
           </w:p>
         </w:tc>
@@ -204,7 +226,29 @@
           </w:tcPr>
           <w:p>
             <w:r>
-              <w:t>-10.62R</w:t>
+              <w:t>-11.07R</w:t>
+            </w:r>
+          </w:p>
+        </w:tc>
+      </w:tr>
+      <w:tr>
+        <w:tc>
+          <w:tcPr>
+            <w:tcW w:type="dxa" w:w="4320"/>
+          </w:tcPr>
+          <w:p>
+            <w:r>
+              <w:t>20K Account Ending</w:t>
+            </w:r>
+          </w:p>
+        </w:tc>
+        <w:tc>
+          <w:tcPr>
+            <w:tcW w:type="dxa" w:w="4320"/>
+          </w:tcPr>
+          <w:p>
+            <w:r>
+              <w:t>$85,088.75</w:t>
             </w:r>
           </w:p>
         </w:tc>
@@ -215,7 +259,7 @@
         <w:pStyle w:val="Heading1"/>
       </w:pPr>
       <w:r>
-        <w:t>Rules</w:t>
+        <w:t>Current Rules</w:t>
       </w:r>
     </w:p>
     <w:p>
@@ -223,7 +267,7 @@
         <w:pStyle w:val="ListBullet"/>
       </w:pPr>
       <w:r>
-        <w:t>Daily candles are resampled to UTC+7 to match the local TradingView chart.</w:t>
+        <w:t>Data: Binance native 1D candles for BTCUSDT, SOLUSDT, and SUIUSDT.</w:t>
       </w:r>
     </w:p>
     <w:p>
@@ -231,7 +275,7 @@
         <w:pStyle w:val="ListBullet"/>
       </w:pPr>
       <w:r>
-        <w:t>Primary LONG: SSL flips bullish, EMA20 cross within last 3 candles, distance to EMA50 &lt;= 2 ATR, RSI14 &gt; 50.</w:t>
+        <w:t>ATR14: TradingView default ATR using Wilder RMA smoothing.</w:t>
       </w:r>
     </w:p>
     <w:p>
@@ -239,7 +283,7 @@
         <w:pStyle w:val="ListBullet"/>
       </w:pPr>
       <w:r>
-        <w:t>Primary SHORT: SSL flips bearish, EMA20 cross down within last 3 candles, distance to EMA50 &lt;= 2 ATR, RSI14 &lt; 50.</w:t>
+        <w:t>SSL Channel: SMA(high,10) and SMA(low,10); state flips bullish when close is above high SMA and bearish when close is below low SMA.</w:t>
       </w:r>
     </w:p>
     <w:p>
@@ -247,7 +291,7 @@
         <w:pStyle w:val="ListBullet"/>
       </w:pPr>
       <w:r>
-        <w:t>Runner A: close 50% at 2.5 ATR, move remaining 50% to breakeven, exit runner on opposite SSL flip.</w:t>
+        <w:t>Primary LONG: SSL flips bullish, price crosses above EMA20 within the last 3 candles, distance from close to EMA50 &lt;= 2 ATR14, and RSI14 &gt; 50.</w:t>
       </w:r>
     </w:p>
     <w:p>
@@ -255,7 +299,47 @@
         <w:pStyle w:val="ListBullet"/>
       </w:pPr>
       <w:r>
-        <w:t>Continuation module is disabled.</w:t>
+        <w:t>Primary SHORT: SSL flips bearish, price crosses below EMA20 within the last 3 candles, distance from close to EMA50 &lt;= 2 ATR14, and RSI14 &lt; 50.</w:t>
+      </w:r>
+    </w:p>
+    <w:p>
+      <w:pPr>
+        <w:pStyle w:val="ListBullet"/>
+      </w:pPr>
+      <w:r>
+        <w:t>20% reversal-skip filter: if the previous trade moved at least 20% in favor from entry, skip the opposite SSL flip entry on the exit candle.</w:t>
+      </w:r>
+    </w:p>
+    <w:p>
+      <w:pPr>
+        <w:pStyle w:val="ListBullet"/>
+      </w:pPr>
+      <w:r>
+        <w:t>Initial stop: 1.5 ATR14 from entry.</w:t>
+      </w:r>
+    </w:p>
+    <w:p>
+      <w:pPr>
+        <w:pStyle w:val="ListBullet"/>
+      </w:pPr>
+      <w:r>
+        <w:t>TP1: 2.5 ATR14 from entry; close 50% at TP1.</w:t>
+      </w:r>
+    </w:p>
+    <w:p>
+      <w:pPr>
+        <w:pStyle w:val="ListBullet"/>
+      </w:pPr>
+      <w:r>
+        <w:t>Runner A: after TP1, move remaining 50% stop to breakeven and exit runner on opposite SSL flip or breakeven stop.</w:t>
+      </w:r>
+    </w:p>
+    <w:p>
+      <w:pPr>
+        <w:pStyle w:val="ListBullet"/>
+      </w:pPr>
+      <w:r>
+        <w:t>Continuation entries are disabled.</w:t>
       </w:r>
     </w:p>
     <w:p>
@@ -266,6 +350,292 @@
         <w:t>Risk-off overlay is disabled.</w:t>
       </w:r>
     </w:p>
+    <w:p>
+      <w:pPr>
+        <w:pStyle w:val="ListBullet"/>
+      </w:pPr>
+      <w:r>
+        <w:t>Round-trip trading cost is included in R results.</w:t>
+      </w:r>
+    </w:p>
+    <w:p>
+      <w:pPr>
+        <w:pStyle w:val="Heading1"/>
+      </w:pPr>
+      <w:r>
+        <w:t>20% Filter Audit</w:t>
+      </w:r>
+    </w:p>
+    <w:p>
+      <w:r>
+        <w:t>Signals skipped by the promoted 20% reversal-skip filter:</w:t>
+      </w:r>
+    </w:p>
+    <w:tbl>
+      <w:tblPr>
+        <w:tblStyle w:val="TableGrid"/>
+        <w:tblW w:type="auto" w:w="0"/>
+        <w:tblLook w:firstColumn="1" w:firstRow="1" w:lastColumn="0" w:lastRow="0" w:noHBand="0" w:noVBand="1" w:val="04A0"/>
+      </w:tblPr>
+      <w:tblGrid>
+        <w:gridCol w:w="2160"/>
+        <w:gridCol w:w="2160"/>
+        <w:gridCol w:w="2160"/>
+        <w:gridCol w:w="2160"/>
+      </w:tblGrid>
+      <w:tr>
+        <w:tc>
+          <w:tcPr>
+            <w:tcW w:type="dxa" w:w="2160"/>
+          </w:tcPr>
+          <w:p>
+            <w:r>
+              <w:t>Symbol</w:t>
+            </w:r>
+          </w:p>
+        </w:tc>
+        <w:tc>
+          <w:tcPr>
+            <w:tcW w:type="dxa" w:w="2160"/>
+          </w:tcPr>
+          <w:p>
+            <w:r>
+              <w:t>Date</w:t>
+            </w:r>
+          </w:p>
+        </w:tc>
+        <w:tc>
+          <w:tcPr>
+            <w:tcW w:type="dxa" w:w="2160"/>
+          </w:tcPr>
+          <w:p>
+            <w:r>
+              <w:t>Side</w:t>
+            </w:r>
+          </w:p>
+        </w:tc>
+        <w:tc>
+          <w:tcPr>
+            <w:tcW w:type="dxa" w:w="2160"/>
+          </w:tcPr>
+          <w:p>
+            <w:r>
+              <w:t>Reason</w:t>
+            </w:r>
+          </w:p>
+        </w:tc>
+      </w:tr>
+      <w:tr>
+        <w:tc>
+          <w:tcPr>
+            <w:tcW w:type="dxa" w:w="2160"/>
+          </w:tcPr>
+          <w:p>
+            <w:r>
+              <w:t>BTC</w:t>
+            </w:r>
+          </w:p>
+        </w:tc>
+        <w:tc>
+          <w:tcPr>
+            <w:tcW w:type="dxa" w:w="2160"/>
+          </w:tcPr>
+          <w:p>
+            <w:r>
+              <w:t>2021-12-23</w:t>
+            </w:r>
+          </w:p>
+        </w:tc>
+        <w:tc>
+          <w:tcPr>
+            <w:tcW w:type="dxa" w:w="2160"/>
+          </w:tcPr>
+          <w:p>
+            <w:r>
+              <w:t>LONG</w:t>
+            </w:r>
+          </w:p>
+        </w:tc>
+        <w:tc>
+          <w:tcPr>
+            <w:tcW w:type="dxa" w:w="2160"/>
+          </w:tcPr>
+          <w:p>
+            <w:r>
+              <w:t>Previous SHORT moved at least 20pct in favor before bullish SSL flip</w:t>
+            </w:r>
+          </w:p>
+        </w:tc>
+      </w:tr>
+      <w:tr>
+        <w:tc>
+          <w:tcPr>
+            <w:tcW w:type="dxa" w:w="2160"/>
+          </w:tcPr>
+          <w:p>
+            <w:r>
+              <w:t>SOL</w:t>
+            </w:r>
+          </w:p>
+        </w:tc>
+        <w:tc>
+          <w:tcPr>
+            <w:tcW w:type="dxa" w:w="2160"/>
+          </w:tcPr>
+          <w:p>
+            <w:r>
+              <w:t>2024-06-27</w:t>
+            </w:r>
+          </w:p>
+        </w:tc>
+        <w:tc>
+          <w:tcPr>
+            <w:tcW w:type="dxa" w:w="2160"/>
+          </w:tcPr>
+          <w:p>
+            <w:r>
+              <w:t>LONG</w:t>
+            </w:r>
+          </w:p>
+        </w:tc>
+        <w:tc>
+          <w:tcPr>
+            <w:tcW w:type="dxa" w:w="2160"/>
+          </w:tcPr>
+          <w:p>
+            <w:r>
+              <w:t>Previous SHORT moved at least 20pct in favor before bullish SSL flip</w:t>
+            </w:r>
+          </w:p>
+        </w:tc>
+      </w:tr>
+      <w:tr>
+        <w:tc>
+          <w:tcPr>
+            <w:tcW w:type="dxa" w:w="2160"/>
+          </w:tcPr>
+          <w:p>
+            <w:r>
+              <w:t>SUI</w:t>
+            </w:r>
+          </w:p>
+        </w:tc>
+        <w:tc>
+          <w:tcPr>
+            <w:tcW w:type="dxa" w:w="2160"/>
+          </w:tcPr>
+          <w:p>
+            <w:r>
+              <w:t>2023-09-29</w:t>
+            </w:r>
+          </w:p>
+        </w:tc>
+        <w:tc>
+          <w:tcPr>
+            <w:tcW w:type="dxa" w:w="2160"/>
+          </w:tcPr>
+          <w:p>
+            <w:r>
+              <w:t>LONG</w:t>
+            </w:r>
+          </w:p>
+        </w:tc>
+        <w:tc>
+          <w:tcPr>
+            <w:tcW w:type="dxa" w:w="2160"/>
+          </w:tcPr>
+          <w:p>
+            <w:r>
+              <w:t>Previous SHORT moved at least 20pct in favor before bullish SSL flip</w:t>
+            </w:r>
+          </w:p>
+        </w:tc>
+      </w:tr>
+      <w:tr>
+        <w:tc>
+          <w:tcPr>
+            <w:tcW w:type="dxa" w:w="2160"/>
+          </w:tcPr>
+          <w:p>
+            <w:r>
+              <w:t>SUI</w:t>
+            </w:r>
+          </w:p>
+        </w:tc>
+        <w:tc>
+          <w:tcPr>
+            <w:tcW w:type="dxa" w:w="2160"/>
+          </w:tcPr>
+          <w:p>
+            <w:r>
+              <w:t>2023-11-21</w:t>
+            </w:r>
+          </w:p>
+        </w:tc>
+        <w:tc>
+          <w:tcPr>
+            <w:tcW w:type="dxa" w:w="2160"/>
+          </w:tcPr>
+          <w:p>
+            <w:r>
+              <w:t>SHORT</w:t>
+            </w:r>
+          </w:p>
+        </w:tc>
+        <w:tc>
+          <w:tcPr>
+            <w:tcW w:type="dxa" w:w="2160"/>
+          </w:tcPr>
+          <w:p>
+            <w:r>
+              <w:t>Previous LONG moved at least 20pct in favor before bearish SSL flip</w:t>
+            </w:r>
+          </w:p>
+        </w:tc>
+      </w:tr>
+      <w:tr>
+        <w:tc>
+          <w:tcPr>
+            <w:tcW w:type="dxa" w:w="2160"/>
+          </w:tcPr>
+          <w:p>
+            <w:r>
+              <w:t>SUI</w:t>
+            </w:r>
+          </w:p>
+        </w:tc>
+        <w:tc>
+          <w:tcPr>
+            <w:tcW w:type="dxa" w:w="2160"/>
+          </w:tcPr>
+          <w:p>
+            <w:r>
+              <w:t>2025-06-09</w:t>
+            </w:r>
+          </w:p>
+        </w:tc>
+        <w:tc>
+          <w:tcPr>
+            <w:tcW w:type="dxa" w:w="2160"/>
+          </w:tcPr>
+          <w:p>
+            <w:r>
+              <w:t>LONG</w:t>
+            </w:r>
+          </w:p>
+        </w:tc>
+        <w:tc>
+          <w:tcPr>
+            <w:tcW w:type="dxa" w:w="2160"/>
+          </w:tcPr>
+          <w:p>
+            <w:r>
+              <w:t>Previous SHORT moved at least 20pct in favor before bullish SSL flip</w:t>
+            </w:r>
+          </w:p>
+        </w:tc>
+      </w:tr>
+    </w:tbl>
     <w:sectPr>
       <w:pgSz w:w="12240" w:h="15840"/>
       <w:pgMar w:top="1440" w:right="1800" w:bottom="1440" w:left="1800" w:header="720" w:footer="720" w:gutter="0"/>

</xml_diff>